<commit_message>
refact: new curriculums & new infos & fixes
</commit_message>
<xml_diff>
--- a/public/resumes/word/HenriqueMascarin_DesenvolvedorMobile.docx
+++ b/public/resumes/word/HenriqueMascarin_DesenvolvedorMobile.docx
@@ -814,7 +814,7 @@
           <w:szCs w:val="22"/>
           <w:lang w:val="pt-BR"/>
         </w:rPr>
-        <w:t>Desenvolvedor Front-</w:t>
+        <w:t>Desenvolvedor Mobile Pleno e Front-</w:t>
       </w:r>
       <w:r>
         <w:rPr>
@@ -834,6 +834,26 @@
           <w:szCs w:val="22"/>
           <w:lang w:val="pt-BR"/>
         </w:rPr>
+        <w:t xml:space="preserve">, especializado em </w:t>
+      </w:r>
+      <w:r>
+        <w:rPr>
+          <w:rFonts w:ascii="Arial" w:hAnsi="Arial" w:eastAsia="Arial" w:cs="Arial"/>
+          <w:noProof w:val="0"/>
+          <w:sz w:val="22"/>
+          <w:szCs w:val="22"/>
+          <w:lang w:val="pt-BR"/>
+        </w:rPr>
+        <w:t>React</w:t>
+      </w:r>
+      <w:r>
+        <w:rPr>
+          <w:rFonts w:ascii="Arial" w:hAnsi="Arial" w:eastAsia="Arial" w:cs="Arial"/>
+          <w:noProof w:val="0"/>
+          <w:sz w:val="22"/>
+          <w:szCs w:val="22"/>
+          <w:lang w:val="pt-BR"/>
+        </w:rPr>
         <w:t xml:space="preserve"> </w:t>
       </w:r>
       <w:r>
@@ -844,116 +864,6 @@
           <w:szCs w:val="22"/>
           <w:lang w:val="pt-BR"/>
         </w:rPr>
-        <w:t>Pleno</w:t>
-      </w:r>
-      <w:r>
-        <w:rPr>
-          <w:rFonts w:ascii="Arial" w:hAnsi="Arial" w:eastAsia="Arial" w:cs="Arial"/>
-          <w:noProof w:val="0"/>
-          <w:sz w:val="22"/>
-          <w:szCs w:val="22"/>
-          <w:lang w:val="pt-BR"/>
-        </w:rPr>
-        <w:t xml:space="preserve"> (</w:t>
-      </w:r>
-      <w:r>
-        <w:rPr>
-          <w:rFonts w:ascii="Arial" w:hAnsi="Arial" w:eastAsia="Arial" w:cs="Arial"/>
-          <w:noProof w:val="0"/>
-          <w:sz w:val="22"/>
-          <w:szCs w:val="22"/>
-          <w:lang w:val="pt-BR"/>
-        </w:rPr>
-        <w:t>f</w:t>
-      </w:r>
-      <w:r>
-        <w:rPr>
-          <w:rFonts w:ascii="Arial" w:hAnsi="Arial" w:eastAsia="Arial" w:cs="Arial"/>
-          <w:noProof w:val="0"/>
-          <w:sz w:val="22"/>
-          <w:szCs w:val="22"/>
-          <w:lang w:val="pt-BR"/>
-        </w:rPr>
-        <w:t>oco em</w:t>
-      </w:r>
-      <w:r>
-        <w:rPr>
-          <w:rFonts w:ascii="Arial" w:hAnsi="Arial" w:eastAsia="Arial" w:cs="Arial"/>
-          <w:noProof w:val="0"/>
-          <w:sz w:val="22"/>
-          <w:szCs w:val="22"/>
-          <w:lang w:val="pt-BR"/>
-        </w:rPr>
-        <w:t xml:space="preserve"> mobile)</w:t>
-      </w:r>
-      <w:r>
-        <w:rPr>
-          <w:rFonts w:ascii="Arial" w:hAnsi="Arial" w:eastAsia="Arial" w:cs="Arial"/>
-          <w:noProof w:val="0"/>
-          <w:sz w:val="22"/>
-          <w:szCs w:val="22"/>
-          <w:lang w:val="pt-BR"/>
-        </w:rPr>
-        <w:t>,</w:t>
-      </w:r>
-      <w:r>
-        <w:rPr>
-          <w:rFonts w:ascii="Arial" w:hAnsi="Arial" w:eastAsia="Arial" w:cs="Arial"/>
-          <w:noProof w:val="0"/>
-          <w:sz w:val="22"/>
-          <w:szCs w:val="22"/>
-          <w:lang w:val="pt-BR"/>
-        </w:rPr>
-        <w:t xml:space="preserve"> </w:t>
-      </w:r>
-      <w:r>
-        <w:rPr>
-          <w:rFonts w:ascii="Arial" w:hAnsi="Arial" w:eastAsia="Arial" w:cs="Arial"/>
-          <w:noProof w:val="0"/>
-          <w:sz w:val="22"/>
-          <w:szCs w:val="22"/>
-          <w:lang w:val="pt-BR"/>
-        </w:rPr>
-        <w:t>especializado em</w:t>
-      </w:r>
-      <w:r>
-        <w:rPr>
-          <w:rFonts w:ascii="Arial" w:hAnsi="Arial" w:eastAsia="Arial" w:cs="Arial"/>
-          <w:noProof w:val="0"/>
-          <w:sz w:val="22"/>
-          <w:szCs w:val="22"/>
-          <w:lang w:val="pt-BR"/>
-        </w:rPr>
-        <w:t xml:space="preserve"> </w:t>
-      </w:r>
-      <w:r>
-        <w:rPr>
-          <w:rFonts w:ascii="Arial" w:hAnsi="Arial" w:eastAsia="Arial" w:cs="Arial"/>
-          <w:noProof w:val="0"/>
-          <w:sz w:val="22"/>
-          <w:szCs w:val="22"/>
-          <w:lang w:val="pt-BR"/>
-        </w:rPr>
-        <w:t>React</w:t>
-      </w:r>
-      <w:r>
-        <w:rPr>
-          <w:rFonts w:ascii="Arial" w:hAnsi="Arial" w:eastAsia="Arial" w:cs="Arial"/>
-          <w:noProof w:val="0"/>
-          <w:sz w:val="22"/>
-          <w:szCs w:val="22"/>
-          <w:lang w:val="pt-BR"/>
-        </w:rPr>
-        <w:t xml:space="preserve"> </w:t>
-      </w:r>
-      <w:r>
-        <w:rPr>
-          <w:rFonts w:ascii="Arial" w:hAnsi="Arial" w:eastAsia="Arial" w:cs="Arial"/>
-          <w:noProof w:val="0"/>
-          <w:sz w:val="22"/>
-          <w:szCs w:val="22"/>
-          <w:lang w:val="pt-BR"/>
-        </w:rPr>
         <w:t>Native</w:t>
       </w:r>
       <w:r>
@@ -964,67 +874,17 @@
           <w:szCs w:val="22"/>
           <w:lang w:val="pt-BR"/>
         </w:rPr>
-        <w:t>,</w:t>
-      </w:r>
-      <w:r>
-        <w:rPr>
-          <w:rFonts w:ascii="Arial" w:hAnsi="Arial" w:eastAsia="Arial" w:cs="Arial"/>
-          <w:noProof w:val="0"/>
-          <w:sz w:val="22"/>
-          <w:szCs w:val="22"/>
-          <w:lang w:val="pt-BR"/>
-        </w:rPr>
-        <w:t xml:space="preserve"> Expo,</w:t>
-      </w:r>
-      <w:r>
-        <w:rPr>
-          <w:rFonts w:ascii="Arial" w:hAnsi="Arial" w:eastAsia="Arial" w:cs="Arial"/>
-          <w:noProof w:val="0"/>
-          <w:sz w:val="22"/>
-          <w:szCs w:val="22"/>
-          <w:lang w:val="pt-BR"/>
-        </w:rPr>
-        <w:t xml:space="preserve"> </w:t>
-      </w:r>
-      <w:r>
-        <w:rPr>
-          <w:rFonts w:ascii="Arial" w:hAnsi="Arial" w:eastAsia="Arial" w:cs="Arial"/>
-          <w:noProof w:val="0"/>
-          <w:sz w:val="22"/>
-          <w:szCs w:val="22"/>
-          <w:lang w:val="pt-BR"/>
-        </w:rPr>
-        <w:t>React</w:t>
-      </w:r>
-      <w:r>
-        <w:rPr>
-          <w:rFonts w:ascii="Arial" w:hAnsi="Arial" w:eastAsia="Arial" w:cs="Arial"/>
-          <w:noProof w:val="0"/>
-          <w:sz w:val="22"/>
-          <w:szCs w:val="22"/>
-          <w:lang w:val="pt-BR"/>
-        </w:rPr>
-        <w:t>.js</w:t>
-      </w:r>
-      <w:r>
-        <w:rPr>
-          <w:rFonts w:ascii="Arial" w:hAnsi="Arial" w:eastAsia="Arial" w:cs="Arial"/>
-          <w:noProof w:val="0"/>
-          <w:sz w:val="22"/>
-          <w:szCs w:val="22"/>
-          <w:lang w:val="pt-BR"/>
-        </w:rPr>
-        <w:t>,</w:t>
-      </w:r>
-      <w:r>
-        <w:rPr>
-          <w:rFonts w:ascii="Arial" w:hAnsi="Arial" w:eastAsia="Arial" w:cs="Arial"/>
-          <w:noProof w:val="0"/>
-          <w:sz w:val="22"/>
-          <w:szCs w:val="22"/>
-          <w:lang w:val="pt-BR"/>
-        </w:rPr>
-        <w:t xml:space="preserve"> Vue.js</w:t>
+        <w:t xml:space="preserve">, Expo, React.js, </w:t>
+      </w:r>
+      <w:r>
+        <w:rPr>
+          <w:rFonts w:ascii="Arial" w:hAnsi="Arial" w:eastAsia="Arial" w:cs="Arial"/>
+          <w:noProof w:val="0"/>
+          <w:sz w:val="22"/>
+          <w:szCs w:val="22"/>
+          <w:lang w:val="pt-BR"/>
+        </w:rPr>
+        <w:t>TypeScript</w:t>
       </w:r>
       <w:r>
         <w:rPr>
@@ -3291,7 +3151,27 @@
           <w:szCs w:val="22"/>
           <w:lang w:val="pt-BR"/>
         </w:rPr>
-        <w:t>Atuo no desenvolvimento do sistema SG Master Web, plataforma de gestão empresarial com milhares de clientes ativos.</w:t>
+        <w:t>At</w:t>
+      </w:r>
+      <w:r>
+        <w:rPr>
+          <w:rFonts w:ascii="Arial" w:hAnsi="Arial" w:eastAsia="Arial" w:cs="Arial"/>
+          <w:noProof w:val="0"/>
+          <w:sz w:val="22"/>
+          <w:szCs w:val="22"/>
+          <w:lang w:val="pt-BR"/>
+        </w:rPr>
+        <w:t>uei</w:t>
+      </w:r>
+      <w:r>
+        <w:rPr>
+          <w:rFonts w:ascii="Arial" w:hAnsi="Arial" w:eastAsia="Arial" w:cs="Arial"/>
+          <w:noProof w:val="0"/>
+          <w:sz w:val="22"/>
+          <w:szCs w:val="22"/>
+          <w:lang w:val="pt-BR"/>
+        </w:rPr>
+        <w:t xml:space="preserve"> no desenvolvimento do sistema SG Master Web, plataforma de gestão empresarial com milhares de clientes ativos.</w:t>
       </w:r>
     </w:p>
     <w:p>

</xml_diff>

<commit_message>
refact: new curriculumns and infos
</commit_message>
<xml_diff>
--- a/public/resumes/word/HenriqueMascarin_DesenvolvedorMobile.docx
+++ b/public/resumes/word/HenriqueMascarin_DesenvolvedorMobile.docx
@@ -1215,7 +1215,7 @@
           <w:szCs w:val="24"/>
           <w:lang w:val="pt-BR"/>
         </w:rPr>
-        <w:t>Fundador e Desenvolvedor Mobile</w:t>
+        <w:t>Desenvolvedor Mobile</w:t>
       </w:r>
       <w:r>
         <w:rPr>
@@ -1240,15 +1240,18 @@
           <w:i w:val="1"/>
           <w:iCs w:val="1"/>
           <w:noProof w:val="0"/>
-          <w:lang w:val="pt-BR"/>
-        </w:rPr>
-        <w:t xml:space="preserve"> </w:t>
-      </w:r>
-      <w:r>
-        <w:rPr>
-          <w:rFonts w:ascii="Arial" w:hAnsi="Arial" w:eastAsia="Arial" w:cs="Arial"/>
-          <w:b w:val="0"/>
-          <w:bCs w:val="0"/>
+          <w:color w:val="000000" w:themeColor="text1" w:themeTint="FF" w:themeShade="FF"/>
+          <w:sz w:val="24"/>
+          <w:szCs w:val="24"/>
+          <w:lang w:val="pt-BR"/>
+        </w:rPr>
+        <w:t xml:space="preserve"> e </w:t>
+      </w:r>
+      <w:r>
+        <w:rPr>
+          <w:rFonts w:ascii="Arial" w:hAnsi="Arial" w:eastAsia="Arial" w:cs="Arial"/>
+          <w:b w:val="1"/>
+          <w:bCs w:val="1"/>
           <w:i w:val="1"/>
           <w:iCs w:val="1"/>
           <w:noProof w:val="0"/>
@@ -1257,22 +1260,34 @@
           <w:szCs w:val="24"/>
           <w:lang w:val="pt-BR"/>
         </w:rPr>
-        <w:t>(</w:t>
-      </w:r>
-      <w:r>
-        <w:rPr>
-          <w:rFonts w:ascii="Arial" w:hAnsi="Arial" w:eastAsia="Arial" w:cs="Arial"/>
-          <w:b w:val="0"/>
-          <w:bCs w:val="0"/>
+        <w:t>Fundador</w:t>
+      </w:r>
+      <w:r>
+        <w:rPr>
+          <w:rFonts w:ascii="Arial" w:hAnsi="Arial" w:eastAsia="Arial" w:cs="Arial"/>
+          <w:b w:val="1"/>
+          <w:bCs w:val="1"/>
           <w:i w:val="1"/>
           <w:iCs w:val="1"/>
           <w:noProof w:val="0"/>
+          <w:lang w:val="pt-BR"/>
+        </w:rPr>
+        <w:t xml:space="preserve"> </w:t>
+      </w:r>
+      <w:r>
+        <w:rPr>
+          <w:rFonts w:ascii="Arial" w:hAnsi="Arial" w:eastAsia="Arial" w:cs="Arial"/>
+          <w:b w:val="0"/>
+          <w:bCs w:val="0"/>
+          <w:i w:val="1"/>
+          <w:iCs w:val="1"/>
+          <w:noProof w:val="0"/>
           <w:color w:val="000000" w:themeColor="text1" w:themeTint="FF" w:themeShade="FF"/>
           <w:sz w:val="24"/>
           <w:szCs w:val="24"/>
           <w:lang w:val="pt-BR"/>
         </w:rPr>
-        <w:t>abril/2023</w:t>
+        <w:t>(</w:t>
       </w:r>
       <w:r>
         <w:rPr>
@@ -1287,7 +1302,7 @@
           <w:szCs w:val="24"/>
           <w:lang w:val="pt-BR"/>
         </w:rPr>
-        <w:t xml:space="preserve"> - </w:t>
+        <w:t>abril/2023</w:t>
       </w:r>
       <w:r>
         <w:rPr>
@@ -1302,7 +1317,7 @@
           <w:szCs w:val="24"/>
           <w:lang w:val="pt-BR"/>
         </w:rPr>
-        <w:t>presente</w:t>
+        <w:t xml:space="preserve"> - </w:t>
       </w:r>
       <w:r>
         <w:rPr>
@@ -1317,11 +1332,27 @@
           <w:szCs w:val="24"/>
           <w:lang w:val="pt-BR"/>
         </w:rPr>
+        <w:t>presente</w:t>
+      </w:r>
+      <w:r>
+        <w:rPr>
+          <w:rFonts w:ascii="Arial" w:hAnsi="Arial" w:eastAsia="Arial" w:cs="Arial"/>
+          <w:b w:val="0"/>
+          <w:bCs w:val="0"/>
+          <w:i w:val="1"/>
+          <w:iCs w:val="1"/>
+          <w:noProof w:val="0"/>
+          <w:color w:val="000000" w:themeColor="text1" w:themeTint="FF" w:themeShade="FF"/>
+          <w:sz w:val="24"/>
+          <w:szCs w:val="24"/>
+          <w:lang w:val="pt-BR"/>
+        </w:rPr>
         <w:t>)</w:t>
       </w:r>
     </w:p>
     <w:p>
       <w:pPr>
+        <w:pStyle w:val="Normal"/>
         <w:keepNext w:val="0"/>
         <w:keepLines w:val="0"/>
         <w:spacing w:before="80" w:beforeAutospacing="off" w:after="0" w:afterAutospacing="off" w:line="276" w:lineRule="auto"/>
@@ -1343,9 +1374,39 @@
           <w:szCs w:val="22"/>
           <w:lang w:val="pt-BR"/>
         </w:rPr>
-        <w:t xml:space="preserve">Atuo como fundador e desenvolvedor do aplicativo </w:t>
-      </w:r>
-      <w:hyperlink r:id="R8926814ecf1a46db">
+        <w:t>Atuo como desenvolvedor</w:t>
+      </w:r>
+      <w:r>
+        <w:rPr>
+          <w:rFonts w:ascii="Arial" w:hAnsi="Arial" w:eastAsia="Arial" w:cs="Arial"/>
+          <w:noProof w:val="0"/>
+          <w:sz w:val="22"/>
+          <w:szCs w:val="22"/>
+          <w:lang w:val="pt-BR"/>
+        </w:rPr>
+        <w:t xml:space="preserve"> Mobile Pleno e </w:t>
+      </w:r>
+      <w:r>
+        <w:rPr>
+          <w:rFonts w:ascii="Arial" w:hAnsi="Arial" w:eastAsia="Arial" w:cs="Arial"/>
+          <w:noProof w:val="0"/>
+          <w:sz w:val="22"/>
+          <w:szCs w:val="22"/>
+          <w:lang w:val="pt-BR"/>
+        </w:rPr>
+        <w:t xml:space="preserve">fundador </w:t>
+      </w:r>
+      <w:r>
+        <w:rPr>
+          <w:rFonts w:ascii="Arial" w:hAnsi="Arial" w:eastAsia="Arial" w:cs="Arial"/>
+          <w:noProof w:val="0"/>
+          <w:sz w:val="22"/>
+          <w:szCs w:val="22"/>
+          <w:lang w:val="pt-BR"/>
+        </w:rPr>
+        <w:t xml:space="preserve">do aplicativo </w:t>
+      </w:r>
+      <w:hyperlink r:id="R6ab00a430c7f4ea6">
         <w:r>
           <w:rPr>
             <w:rStyle w:val="Hyperlink"/>
@@ -1368,7 +1429,7 @@
         </w:rPr>
         <w:t xml:space="preserve">, temporizador com sons do seu dispositivo, publicado na </w:t>
       </w:r>
-      <w:hyperlink r:id="Rd81162f789014069">
+      <w:hyperlink r:id="R81a8ea8371cc4fd8">
         <w:r>
           <w:rPr>
             <w:rStyle w:val="Hyperlink"/>

</xml_diff>

<commit_message>
fix: little fixes in cvs
</commit_message>
<xml_diff>
--- a/public/resumes/word/HenriqueMascarin_DesenvolvedorMobile.docx
+++ b/public/resumes/word/HenriqueMascarin_DesenvolvedorMobile.docx
@@ -3043,6 +3043,11 @@
       </w:r>
       <w:r>
         <w:rPr>
+          <w:rFonts w:ascii="Arial" w:hAnsi="Arial" w:eastAsia="Arial" w:cs="Arial"/>
+          <w:b w:val="1"/>
+          <w:bCs w:val="1"/>
+          <w:i w:val="0"/>
+          <w:iCs w:val="0"/>
           <w:noProof w:val="0"/>
           <w:lang w:val="pt-BR"/>
         </w:rPr>
@@ -3053,8 +3058,8 @@
           <w:rFonts w:ascii="Arial" w:hAnsi="Arial" w:eastAsia="Arial" w:cs="Arial"/>
           <w:b w:val="1"/>
           <w:bCs w:val="1"/>
-          <w:i w:val="0"/>
-          <w:iCs w:val="0"/>
+          <w:i w:val="1"/>
+          <w:iCs w:val="1"/>
           <w:noProof w:val="0"/>
           <w:color w:val="000000" w:themeColor="text1" w:themeTint="FF" w:themeShade="FF"/>
           <w:sz w:val="24"/>
@@ -3068,24 +3073,21 @@
           <w:rFonts w:ascii="Arial" w:hAnsi="Arial" w:eastAsia="Arial" w:cs="Arial"/>
           <w:b w:val="1"/>
           <w:bCs w:val="1"/>
-          <w:i w:val="0"/>
-          <w:iCs w:val="0"/>
-          <w:noProof w:val="0"/>
-          <w:color w:val="000000" w:themeColor="text1" w:themeTint="FF" w:themeShade="FF"/>
-          <w:sz w:val="26"/>
-          <w:szCs w:val="26"/>
-          <w:lang w:val="pt-BR"/>
-        </w:rPr>
-        <w:t xml:space="preserve"> </w:t>
-      </w:r>
-      <w:r>
-        <w:rPr>
-          <w:rFonts w:ascii="Arial" w:hAnsi="Arial" w:eastAsia="Arial" w:cs="Arial"/>
-          <w:b w:val="1"/>
-          <w:bCs w:val="1"/>
           <w:i w:val="1"/>
           <w:iCs w:val="1"/>
           <w:noProof w:val="0"/>
+          <w:lang w:val="pt-BR"/>
+        </w:rPr>
+        <w:t xml:space="preserve"> </w:t>
+      </w:r>
+      <w:r>
+        <w:rPr>
+          <w:rFonts w:ascii="Arial" w:hAnsi="Arial" w:eastAsia="Arial" w:cs="Arial"/>
+          <w:b w:val="1"/>
+          <w:bCs w:val="1"/>
+          <w:i w:val="1"/>
+          <w:iCs w:val="1"/>
+          <w:noProof w:val="0"/>
           <w:color w:val="000000" w:themeColor="text1" w:themeTint="FF" w:themeShade="FF"/>
           <w:sz w:val="24"/>
           <w:szCs w:val="24"/>
@@ -3106,7 +3108,22 @@
           <w:szCs w:val="24"/>
           <w:lang w:val="pt-BR"/>
         </w:rPr>
-        <w:t>end Pleno</w:t>
+        <w:t>end</w:t>
+      </w:r>
+      <w:r>
+        <w:rPr>
+          <w:rFonts w:ascii="Arial" w:hAnsi="Arial" w:eastAsia="Arial" w:cs="Arial"/>
+          <w:b w:val="1"/>
+          <w:bCs w:val="1"/>
+          <w:i w:val="1"/>
+          <w:iCs w:val="1"/>
+          <w:noProof w:val="0"/>
+          <w:color w:val="000000" w:themeColor="text1" w:themeTint="FF" w:themeShade="FF"/>
+          <w:sz w:val="24"/>
+          <w:szCs w:val="24"/>
+          <w:lang w:val="pt-BR"/>
+        </w:rPr>
+        <w:t xml:space="preserve"> Pleno</w:t>
       </w:r>
       <w:r>
         <w:rPr>

</xml_diff>